<commit_message>
docs: log 19 août journée + document the super_admin role
Updated in place, not new dated files: journal-activite.json gets a
second day entry, documentation-technique.docx gains the super-admin
section and the cap sync gotcha from today's mobile config bug.
</commit_message>
<xml_diff>
--- a/docs/documentation-technique.docx
+++ b/docs/documentation-technique.docx
@@ -810,7 +810,7 @@
                 <w:sz w:val="20"/>
                 <w:szCs w:val="20"/>
               </w:rPr>
-              <w:t xml:space="preserve">Dépôt de code</w:t>
+              <w:t xml:space="preserve">Monitoring performance</w:t>
             </w:r>
           </w:p>
         </w:tc>
@@ -818,6 +818,60 @@
           <w:tcPr>
             <w:tcW w:type="dxa" w:w="6400"/>
             <w:shd w:fill="F3F4F6" w:val="clear"/>
+            <w:tcMar>
+              <w:top w:type="dxa" w:w="100"/>
+              <w:left w:type="dxa" w:w="120"/>
+              <w:bottom w:type="dxa" w:w="100"/>
+              <w:right w:type="dxa" w:w="120"/>
+            </w:tcMar>
+          </w:tcPr>
+          <w:p>
+            <w:pPr>
+              <w:jc w:val="left"/>
+            </w:pPr>
+            <w:r>
+              <w:rPr>
+                <w:b w:val="false"/>
+                <w:bCs w:val="false"/>
+                <w:color w:val="1a1a1a"/>
+                <w:sz w:val="20"/>
+                <w:szCs w:val="20"/>
+              </w:rPr>
+              <w:t xml:space="preserve">Vercel Speed Insights (Web Vitals réels : TTFB, LCP, CLS, INP)</w:t>
+            </w:r>
+          </w:p>
+        </w:tc>
+      </w:tr>
+      <w:tr>
+        <w:tc>
+          <w:tcPr>
+            <w:tcW w:type="dxa" w:w="3200"/>
+            <w:tcMar>
+              <w:top w:type="dxa" w:w="100"/>
+              <w:left w:type="dxa" w:w="120"/>
+              <w:bottom w:type="dxa" w:w="100"/>
+              <w:right w:type="dxa" w:w="120"/>
+            </w:tcMar>
+          </w:tcPr>
+          <w:p>
+            <w:pPr>
+              <w:jc w:val="left"/>
+            </w:pPr>
+            <w:r>
+              <w:rPr>
+                <w:b/>
+                <w:bCs/>
+                <w:color w:val="1a1a1a"/>
+                <w:sz w:val="20"/>
+                <w:szCs w:val="20"/>
+              </w:rPr>
+              <w:t xml:space="preserve">Dépôt de code</w:t>
+            </w:r>
+          </w:p>
+        </w:tc>
+        <w:tc>
+          <w:tcPr>
+            <w:tcW w:type="dxa" w:w="6400"/>
             <w:tcMar>
               <w:top w:type="dxa" w:w="100"/>
               <w:left w:type="dxa" w:w="120"/>
@@ -940,7 +994,7 @@
           <w:sz w:val="19"/>
           <w:szCs w:val="19"/>
         </w:rPr>
-        <w:t xml:space="preserve">│  └─ admin/                  overview, planning, apartments, users, notifications</w:t>
+        <w:t xml:space="preserve">│  ├─ admin/                  overview, planning, apartments, users, notifications</w:t>
       </w:r>
     </w:p>
     <w:p>
@@ -954,7 +1008,7 @@
           <w:sz w:val="19"/>
           <w:szCs w:val="19"/>
         </w:rPr>
-        <w:t xml:space="preserve">├─ src/lib/supabase/         clients Supabase (browser / server / middleware)</w:t>
+        <w:t xml:space="preserve">│  └─ super-admin/            overview, users (comptes/sessions), activity</w:t>
       </w:r>
     </w:p>
     <w:p>
@@ -968,7 +1022,7 @@
           <w:sz w:val="19"/>
           <w:szCs w:val="19"/>
         </w:rPr>
-        <w:t xml:space="preserve">├─ src/types/                types TypeScript du schéma DB</w:t>
+        <w:t xml:space="preserve">├─ src/lib/supabase/         clients Supabase (browser / server / middleware / admin)</w:t>
       </w:r>
     </w:p>
     <w:p>
@@ -982,7 +1036,7 @@
           <w:sz w:val="19"/>
           <w:szCs w:val="19"/>
         </w:rPr>
-        <w:t xml:space="preserve">├─ src/proxy.ts              protection des routes par session/rôle</w:t>
+        <w:t xml:space="preserve">├─ src/types/                types TypeScript du schéma DB</w:t>
       </w:r>
     </w:p>
     <w:p>
@@ -996,7 +1050,7 @@
           <w:sz w:val="19"/>
           <w:szCs w:val="19"/>
         </w:rPr>
-        <w:t xml:space="preserve">├─ supabase/migrations/      schéma SQL + RLS (0001_init.sql)</w:t>
+        <w:t xml:space="preserve">├─ src/proxy.ts              protection des routes par session/rôle</w:t>
       </w:r>
     </w:p>
     <w:p>
@@ -1010,7 +1064,7 @@
           <w:sz w:val="19"/>
           <w:szCs w:val="19"/>
         </w:rPr>
-        <w:t xml:space="preserve">├─ docs/                      cette documentation + le rapport d'activité</w:t>
+        <w:t xml:space="preserve">├─ supabase/migrations/      schéma SQL + RLS (0001_init.sql, 0002_super_admin.sql)</w:t>
       </w:r>
     </w:p>
     <w:p>
@@ -1024,7 +1078,7 @@
           <w:sz w:val="19"/>
           <w:szCs w:val="19"/>
         </w:rPr>
-        <w:t xml:space="preserve">├─ capacitor.config.ts       config des coquilles iOS/Android</w:t>
+        <w:t xml:space="preserve">├─ docs/                      cette documentation + le rapport d'activité</w:t>
       </w:r>
     </w:p>
     <w:p>
@@ -1038,7 +1092,7 @@
           <w:sz w:val="19"/>
           <w:szCs w:val="19"/>
         </w:rPr>
-        <w:t xml:space="preserve">├─ ios/                      projet Xcode généré par Capacitor</w:t>
+        <w:t xml:space="preserve">├─ capacitor.config.ts       config des coquilles iOS/Android</w:t>
       </w:r>
     </w:p>
     <w:p>
@@ -1052,6 +1106,20 @@
           <w:sz w:val="19"/>
           <w:szCs w:val="19"/>
         </w:rPr>
+        <w:t xml:space="preserve">├─ ios/                      projet Xcode généré par Capacitor</w:t>
+      </w:r>
+    </w:p>
+    <w:p>
+      <w:pPr>
+        <w:spacing w:after="60"/>
+      </w:pPr>
+      <w:r>
+        <w:rPr>
+          <w:rFonts w:ascii="Courier New" w:cs="Courier New" w:eastAsia="Courier New" w:hAnsi="Courier New"/>
+          <w:color w:val="0f172a"/>
+          <w:sz w:val="19"/>
+          <w:szCs w:val="19"/>
+        </w:rPr>
         <w:t xml:space="preserve">└─ android/                  projet Android Studio généré par Capacitor</w:t>
       </w:r>
     </w:p>
@@ -1081,7 +1149,7 @@
           <w:sz w:val="21"/>
           <w:szCs w:val="21"/>
         </w:rPr>
-        <w:t xml:space="preserve">Schéma défini dans supabase/migrations/0001_init.sql, avec Row Level Security activée sur toutes les tables.</w:t>
+        <w:t xml:space="preserve">Schéma défini dans supabase/migrations/ (0001_init.sql puis 0002_super_admin.sql), avec Row Level Security activée sur toutes les tables.</w:t>
       </w:r>
     </w:p>
     <w:tbl>
@@ -1208,7 +1276,7 @@
                 <w:sz w:val="20"/>
                 <w:szCs w:val="20"/>
               </w:rPr>
-              <w:t xml:space="preserve">1 ligne par utilisateur (auth.users). Rôle admin/employee, nom, email, téléphone. Créée automatiquement à l'inscription via trigger.</w:t>
+              <w:t xml:space="preserve">1 ligne par utilisateur (auth.users). Rôle employee/admin/super_admin, nom, email, téléphone. Créée automatiquement à l'inscription via trigger.</w:t>
             </w:r>
           </w:p>
         </w:tc>
@@ -1539,7 +1607,7 @@
           <w:sz w:val="21"/>
           <w:szCs w:val="21"/>
         </w:rPr>
-        <w:t xml:space="preserve">Un admin (fonction is_admin() basée sur profiles.role) a un accès complet en lecture/écriture sur toutes les tables.</w:t>
+        <w:t xml:space="preserve">La fonction is_admin() couvre les rôles admin ET super_admin : toute policy "admin peut faire X" s'applique donc automatiquement aux deux, sans duplication. is_super_admin() existe séparément pour les cas qui doivent rester exclusifs au super-admin.</w:t>
       </w:r>
     </w:p>
     <w:p>
@@ -1558,6 +1626,24 @@
           <w:szCs w:val="21"/>
         </w:rPr>
         <w:t xml:space="preserve">Le bucket de stockage task-photos est privé : accès réservé aux utilisateurs authentifiés, upload réservé à l'assigné·e de la tâche ou à l'admin.</w:t>
+      </w:r>
+    </w:p>
+    <w:p>
+      <w:pPr>
+        <w:pStyle w:val="ListParagraph"/>
+        <w:numPr>
+          <w:ilvl w:val="0"/>
+          <w:numId w:val="1"/>
+        </w:numPr>
+        <w:spacing w:after="60"/>
+      </w:pPr>
+      <w:r>
+        <w:rPr>
+          <w:color w:val="1a1a1a"/>
+          <w:sz w:val="21"/>
+          <w:szCs w:val="21"/>
+        </w:rPr>
+        <w:t xml:space="preserve">Les actions les plus sensibles (déconnexion forcée, suppression de compte) ne passent pas par RLS : elles utilisent la clé service_role côté serveur (src/lib/supabase/admin.ts), jamais exposée au client.</w:t>
       </w:r>
     </w:p>
     <w:p>
@@ -1627,43 +1713,43 @@
           <w:sz w:val="21"/>
           <w:szCs w:val="21"/>
         </w:rPr>
-        <w:t xml:space="preserve">Le premier compte admin est promu manuellement en SQL ; ensuite, les admins peuvent promouvoir d'autres comptes depuis l'écran "Équipe".</w:t>
-      </w:r>
-    </w:p>
-    <w:p>
-      <w:pPr>
-        <w:pStyle w:val="ListParagraph"/>
-        <w:numPr>
-          <w:ilvl w:val="0"/>
-          <w:numId w:val="1"/>
-        </w:numPr>
-        <w:spacing w:after="60"/>
-      </w:pPr>
-      <w:r>
-        <w:rPr>
-          <w:color w:val="1a1a1a"/>
-          <w:sz w:val="21"/>
-          <w:szCs w:val="21"/>
-        </w:rPr>
-        <w:t xml:space="preserve">Chaque connexion (Google ou mot de passe) est enregistrée dans activity_log — c'est ce qui alimente le suivi "qui se connecte, quand" côté admin.</w:t>
-      </w:r>
-    </w:p>
-    <w:p>
-      <w:pPr>
-        <w:pStyle w:val="ListParagraph"/>
-        <w:numPr>
-          <w:ilvl w:val="0"/>
-          <w:numId w:val="1"/>
-        </w:numPr>
-        <w:spacing w:after="60"/>
-      </w:pPr>
-      <w:r>
-        <w:rPr>
-          <w:color w:val="1a1a1a"/>
-          <w:sz w:val="21"/>
-          <w:szCs w:val="21"/>
-        </w:rPr>
-        <w:t xml:space="preserve">src/proxy.ts protège les routes : redirection vers /login si non connecté, redirection hors de /admin si le rôle n'est pas admin.</w:t>
+        <w:t xml:space="preserve">Le premier compte admin est promu manuellement en SQL ; ensuite, les admins peuvent promouvoir d'autres comptes depuis l'écran "Équipe", et les super-admins depuis "Comptes &amp; sessions".</w:t>
+      </w:r>
+    </w:p>
+    <w:p>
+      <w:pPr>
+        <w:pStyle w:val="ListParagraph"/>
+        <w:numPr>
+          <w:ilvl w:val="0"/>
+          <w:numId w:val="1"/>
+        </w:numPr>
+        <w:spacing w:after="60"/>
+      </w:pPr>
+      <w:r>
+        <w:rPr>
+          <w:color w:val="1a1a1a"/>
+          <w:sz w:val="21"/>
+          <w:szCs w:val="21"/>
+        </w:rPr>
+        <w:t xml:space="preserve">Chaque connexion (Google ou mot de passe) est enregistrée dans activity_log — c'est ce qui alimente le suivi "qui se connecte, quand".</w:t>
+      </w:r>
+    </w:p>
+    <w:p>
+      <w:pPr>
+        <w:pStyle w:val="ListParagraph"/>
+        <w:numPr>
+          <w:ilvl w:val="0"/>
+          <w:numId w:val="1"/>
+        </w:numPr>
+        <w:spacing w:after="60"/>
+      </w:pPr>
+      <w:r>
+        <w:rPr>
+          <w:color w:val="1a1a1a"/>
+          <w:sz w:val="21"/>
+          <w:szCs w:val="21"/>
+        </w:rPr>
+        <w:t xml:space="preserve">src/proxy.ts protège les routes : redirection vers /login si non connecté, hors de /admin si ni admin ni super_admin, hors de /super-admin si le rôle n'est pas exactement super_admin.</w:t>
       </w:r>
     </w:p>
     <w:p>
@@ -1821,7 +1907,7 @@
           <w:sz w:val="21"/>
           <w:szCs w:val="21"/>
         </w:rPr>
-        <w:t xml:space="preserve">Accès web uniquement, protégé par rôle (profiles.role = 'admin')</w:t>
+        <w:t xml:space="preserve">Accès web uniquement, protégé par rôle (admin ou super_admin)</w:t>
       </w:r>
     </w:p>
     <w:p>
@@ -1945,7 +2031,113 @@
           <w:sz w:val="30"/>
           <w:szCs w:val="30"/>
         </w:rPr>
-        <w:t xml:space="preserve">9. Déploiement &amp; infrastructure</w:t>
+        <w:t xml:space="preserve">9. Fonctionnalités — Espace super-admin (dev)</w:t>
+      </w:r>
+    </w:p>
+    <w:p>
+      <w:pPr>
+        <w:pStyle w:val="ListParagraph"/>
+        <w:numPr>
+          <w:ilvl w:val="0"/>
+          <w:numId w:val="1"/>
+        </w:numPr>
+        <w:spacing w:after="60"/>
+      </w:pPr>
+      <w:r>
+        <w:rPr>
+          <w:color w:val="1a1a1a"/>
+          <w:sz w:val="21"/>
+          <w:szCs w:val="21"/>
+        </w:rPr>
+        <w:t xml:space="preserve">Section /super-admin séparée, réservée au rôle super_admin (accès développeur, distinct de l'admin métier)</w:t>
+      </w:r>
+    </w:p>
+    <w:p>
+      <w:pPr>
+        <w:pStyle w:val="ListParagraph"/>
+        <w:numPr>
+          <w:ilvl w:val="0"/>
+          <w:numId w:val="1"/>
+        </w:numPr>
+        <w:spacing w:after="60"/>
+      </w:pPr>
+      <w:r>
+        <w:rPr>
+          <w:color w:val="1a1a1a"/>
+          <w:sz w:val="21"/>
+          <w:szCs w:val="21"/>
+        </w:rPr>
+        <w:t xml:space="preserve">Vue d'ensemble : répartition des comptes par rôle, volume d'événements journalisés, liens directs vers Vercel (Observability/Speed Insights, déploiements), Supabase et Google Cloud</w:t>
+      </w:r>
+    </w:p>
+    <w:p>
+      <w:pPr>
+        <w:pStyle w:val="ListParagraph"/>
+        <w:numPr>
+          <w:ilvl w:val="0"/>
+          <w:numId w:val="1"/>
+        </w:numPr>
+        <w:spacing w:after="60"/>
+      </w:pPr>
+      <w:r>
+        <w:rPr>
+          <w:color w:val="1a1a1a"/>
+          <w:sz w:val="21"/>
+          <w:szCs w:val="21"/>
+        </w:rPr>
+        <w:t xml:space="preserve">Comptes &amp; sessions : tous les comptes avec dernière connexion réelle (auth.users.last_sign_in_at), changement de rôle, déconnexion forcée (invalide toutes les sessions actives), suppression de compte</w:t>
+      </w:r>
+    </w:p>
+    <w:p>
+      <w:pPr>
+        <w:pStyle w:val="ListParagraph"/>
+        <w:numPr>
+          <w:ilvl w:val="0"/>
+          <w:numId w:val="1"/>
+        </w:numPr>
+        <w:spacing w:after="60"/>
+      </w:pPr>
+      <w:r>
+        <w:rPr>
+          <w:color w:val="1a1a1a"/>
+          <w:sz w:val="21"/>
+          <w:szCs w:val="21"/>
+        </w:rPr>
+        <w:t xml:space="preserve">Activité : journal complet (200 derniers événements) tous comptes confondus, y compris les actions super-admin elles-mêmes</w:t>
+      </w:r>
+    </w:p>
+    <w:p>
+      <w:pPr>
+        <w:pStyle w:val="ListParagraph"/>
+        <w:numPr>
+          <w:ilvl w:val="0"/>
+          <w:numId w:val="1"/>
+        </w:numPr>
+        <w:spacing w:after="60"/>
+      </w:pPr>
+      <w:r>
+        <w:rPr>
+          <w:color w:val="1a1a1a"/>
+          <w:sz w:val="21"/>
+          <w:szCs w:val="21"/>
+        </w:rPr>
+        <w:t xml:space="preserve">La performance applicative (temps de réponse API, Web Vitals) n'est pas réimplémentée en interne : renvoi vers les dashboards natifs Vercel/Supabase, plus fiables et déjà disponibles gratuitement</w:t>
+      </w:r>
+    </w:p>
+    <w:p>
+      <w:pPr>
+        <w:pStyle w:val="Heading1"/>
+        <w:spacing w:after="160" w:before="360"/>
+      </w:pPr>
+      <w:r>
+        <w:rPr>
+          <w:b/>
+          <w:bCs/>
+          <w:color w:val="1a1a1a"/>
+          <w:sz w:val="30"/>
+          <w:szCs w:val="30"/>
+        </w:rPr>
+        <w:t xml:space="preserve">10. Déploiement &amp; infrastructure</w:t>
       </w:r>
     </w:p>
     <w:tbl>
@@ -2262,7 +2454,7 @@
           <w:sz w:val="30"/>
           <w:szCs w:val="30"/>
         </w:rPr>
-        <w:t xml:space="preserve">10. Mobile (Capacitor)</w:t>
+        <w:t xml:space="preserve">11. Mobile (Capacitor)</w:t>
       </w:r>
     </w:p>
     <w:p>
@@ -2289,7 +2481,7 @@
           <w:sz w:val="19"/>
           <w:szCs w:val="19"/>
         </w:rPr>
-        <w:t xml:space="preserve">npm run cap:sync      # après un changement de config/plugin</w:t>
+        <w:t xml:space="preserve">npm run cap:sync      # après un changement de config/plugin — IMPORTANT :</w:t>
       </w:r>
     </w:p>
     <w:p>
@@ -2303,7 +2495,7 @@
           <w:sz w:val="19"/>
           <w:szCs w:val="19"/>
         </w:rPr>
-        <w:t xml:space="preserve">npm run cap:ios       # ouvre ios/App/App.xcworkspace dans Xcode</w:t>
+        <w:t xml:space="preserve">                      # aucun effet sur les apps déjà installées tant que</w:t>
       </w:r>
     </w:p>
     <w:p>
@@ -2317,6 +2509,34 @@
           <w:sz w:val="19"/>
           <w:szCs w:val="19"/>
         </w:rPr>
+        <w:t xml:space="preserve">                      # ce n'est pas relancé (piège vécu : URL non à jour)</w:t>
+      </w:r>
+    </w:p>
+    <w:p>
+      <w:pPr>
+        <w:spacing w:after="60"/>
+      </w:pPr>
+      <w:r>
+        <w:rPr>
+          <w:rFonts w:ascii="Courier New" w:cs="Courier New" w:eastAsia="Courier New" w:hAnsi="Courier New"/>
+          <w:color w:val="0f172a"/>
+          <w:sz w:val="19"/>
+          <w:szCs w:val="19"/>
+        </w:rPr>
+        <w:t xml:space="preserve">npm run cap:ios       # ouvre ios/App/App.xcworkspace dans Xcode</w:t>
+      </w:r>
+    </w:p>
+    <w:p>
+      <w:pPr>
+        <w:spacing w:after="60"/>
+      </w:pPr>
+      <w:r>
+        <w:rPr>
+          <w:rFonts w:ascii="Courier New" w:cs="Courier New" w:eastAsia="Courier New" w:hAnsi="Courier New"/>
+          <w:color w:val="0f172a"/>
+          <w:sz w:val="19"/>
+          <w:szCs w:val="19"/>
+        </w:rPr>
         <w:t xml:space="preserve">npm run cap:android   # ouvre le projet dans Android Studio</w:t>
       </w:r>
     </w:p>
@@ -2382,7 +2602,7 @@
           <w:sz w:val="30"/>
           <w:szCs w:val="30"/>
         </w:rPr>
-        <w:t xml:space="preserve">11. État actuel &amp; reste à faire</w:t>
+        <w:t xml:space="preserve">12. État actuel &amp; reste à faire</w:t>
       </w:r>
     </w:p>
     <w:p>
@@ -2416,25 +2636,25 @@
           <w:sz w:val="21"/>
           <w:szCs w:val="21"/>
         </w:rPr>
-        <w:t xml:space="preserve">Squelette complet fonctionnel, déployé et testé en conditions réelles (connexion Google vérifiée, compte admin opérationnel).</w:t>
-      </w:r>
-    </w:p>
-    <w:p>
-      <w:pPr>
-        <w:pStyle w:val="ListParagraph"/>
-        <w:numPr>
-          <w:ilvl w:val="0"/>
-          <w:numId w:val="1"/>
-        </w:numPr>
-        <w:spacing w:after="60"/>
-      </w:pPr>
-      <w:r>
-        <w:rPr>
-          <w:color w:val="1a1a1a"/>
-          <w:sz w:val="21"/>
-          <w:szCs w:val="21"/>
-        </w:rPr>
-        <w:t xml:space="preserve">Schéma de données et sécurité en place.</w:t>
+        <w:t xml:space="preserve">Squelette complet fonctionnel, déployé et testé en conditions réelles (connexion Google vérifiée, comptes admin et super-admin opérationnels).</w:t>
+      </w:r>
+    </w:p>
+    <w:p>
+      <w:pPr>
+        <w:pStyle w:val="ListParagraph"/>
+        <w:numPr>
+          <w:ilvl w:val="0"/>
+          <w:numId w:val="1"/>
+        </w:numPr>
+        <w:spacing w:after="60"/>
+      </w:pPr>
+      <w:r>
+        <w:rPr>
+          <w:color w:val="1a1a1a"/>
+          <w:sz w:val="21"/>
+          <w:szCs w:val="21"/>
+        </w:rPr>
+        <w:t xml:space="preserve">Schéma de données et sécurité en place, y compris le rôle super-admin (comptes, sessions, suppression).</w:t>
       </w:r>
     </w:p>
     <w:p>
@@ -2453,6 +2673,24 @@
           <w:szCs w:val="21"/>
         </w:rPr>
         <w:t xml:space="preserve">Authentification Google + email/mot de passe opérationnelle en production.</w:t>
+      </w:r>
+    </w:p>
+    <w:p>
+      <w:pPr>
+        <w:pStyle w:val="ListParagraph"/>
+        <w:numPr>
+          <w:ilvl w:val="0"/>
+          <w:numId w:val="1"/>
+        </w:numPr>
+        <w:spacing w:after="60"/>
+      </w:pPr>
+      <w:r>
+        <w:rPr>
+          <w:color w:val="1a1a1a"/>
+          <w:sz w:val="21"/>
+          <w:szCs w:val="21"/>
+        </w:rPr>
+        <w:t xml:space="preserve">Monitoring de performance réel (Vercel Speed Insights) actif.</w:t>
       </w:r>
     </w:p>
     <w:p>

</xml_diff>

<commit_message>
docs: log design system integration in the 19 août entry
Same approach as before: appended to the existing day entry rather than
creating a new one, and refreshed the technical doc's data model,
feature lists, and repo tree for checklists/proofs/profile.
</commit_message>
<xml_diff>
--- a/docs/documentation-technique.docx
+++ b/docs/documentation-technique.docx
@@ -451,7 +451,7 @@
                 <w:sz w:val="20"/>
                 <w:szCs w:val="20"/>
               </w:rPr>
-              <w:t xml:space="preserve">Tailwind CSS 4</w:t>
+              <w:t xml:space="preserve">Tailwind CSS 4 — tokens de design dédiés : app-* (clair « Naturel », app employé) et adm-* (sombre « Hôtellerie », admin + super-admin)</w:t>
             </w:r>
           </w:p>
         </w:tc>
@@ -980,7 +980,7 @@
           <w:sz w:val="19"/>
           <w:szCs w:val="19"/>
         </w:rPr>
-        <w:t xml:space="preserve">│  ├─ (employee)/            dashboard, tasks/:id, notifications</w:t>
+        <w:t xml:space="preserve">│  ├─ (employee)/            dashboard, tasks/:id (+ items/:itemId), notifications, profile</w:t>
       </w:r>
     </w:p>
     <w:p>
@@ -994,7 +994,7 @@
           <w:sz w:val="19"/>
           <w:szCs w:val="19"/>
         </w:rPr>
-        <w:t xml:space="preserve">│  ├─ admin/                  overview, planning, apartments, users, notifications</w:t>
+        <w:t xml:space="preserve">│  ├─ admin/                  overview, planning, apartments, checklists, proofs, users, notifications</w:t>
       </w:r>
     </w:p>
     <w:p>
@@ -1332,7 +1332,7 @@
                 <w:sz w:val="20"/>
                 <w:szCs w:val="20"/>
               </w:rPr>
-              <w:t xml:space="preserve">Appartements/logements à nettoyer : nom, adresse, notes (codes d'accès, consignes).</w:t>
+              <w:t xml:space="preserve">Appartements/logements à nettoyer : nom, adresse, notes (codes d'accès, consignes), checklist appliquée (template_id).</w:t>
             </w:r>
           </w:p>
         </w:tc>
@@ -1360,7 +1360,7 @@
                 <w:sz w:val="20"/>
                 <w:szCs w:val="20"/>
               </w:rPr>
-              <w:t xml:space="preserve">tasks</w:t>
+              <w:t xml:space="preserve">checklist_templates</w:t>
             </w:r>
           </w:p>
         </w:tc>
@@ -1386,7 +1386,7 @@
                 <w:sz w:val="20"/>
                 <w:szCs w:val="20"/>
               </w:rPr>
-              <w:t xml:space="preserve">Une tâche de ménage = un appartement, une date, un·e employé·e assigné·e, un statut (à faire / en cours / terminé / reporté), un flag urgent.</w:t>
+              <w:t xml:space="preserve">Modèles de checklist réutilisables (ex: Standard, Départ locataire, Grand ménage), assignés à un ou plusieurs appartements.</w:t>
             </w:r>
           </w:p>
         </w:tc>
@@ -1415,7 +1415,7 @@
                 <w:sz w:val="20"/>
                 <w:szCs w:val="20"/>
               </w:rPr>
-              <w:t xml:space="preserve">task_photos</w:t>
+              <w:t xml:space="preserve">checklist_items</w:t>
             </w:r>
           </w:p>
         </w:tc>
@@ -1442,7 +1442,7 @@
                 <w:sz w:val="20"/>
                 <w:szCs w:val="20"/>
               </w:rPr>
-              <w:t xml:space="preserve">Photos déposées par les employés pour une tâche, stockées dans Supabase Storage.</w:t>
+              <w:t xml:space="preserve">Items d'un modèle : pièce, libellé, exigence photo (aucune / après / avant+après), ordre d'affichage.</w:t>
             </w:r>
           </w:p>
         </w:tc>
@@ -1470,7 +1470,7 @@
                 <w:sz w:val="20"/>
                 <w:szCs w:val="20"/>
               </w:rPr>
-              <w:t xml:space="preserve">notifications</w:t>
+              <w:t xml:space="preserve">tasks</w:t>
             </w:r>
           </w:p>
         </w:tc>
@@ -1496,7 +1496,7 @@
                 <w:sz w:val="20"/>
                 <w:szCs w:val="20"/>
               </w:rPr>
-              <w:t xml:space="preserve">Notifications envoyées par l'admin (ciblées ou en broadcast) : info, rappel, urgent.</w:t>
+              <w:t xml:space="preserve">Une tâche de ménage = un appartement, une date, un·e employé·e assigné·e, un statut (à faire / en cours / terminé / reporté), un flag urgent, validation admin (validated_at/by, redo_reason).</w:t>
             </w:r>
           </w:p>
         </w:tc>
@@ -1525,7 +1525,7 @@
                 <w:sz w:val="20"/>
                 <w:szCs w:val="20"/>
               </w:rPr>
-              <w:t xml:space="preserve">activity_log</w:t>
+              <w:t xml:space="preserve">task_items</w:t>
             </w:r>
           </w:p>
         </w:tc>
@@ -1552,7 +1552,171 @@
                 <w:sz w:val="20"/>
                 <w:szCs w:val="20"/>
               </w:rPr>
-              <w:t xml:space="preserve">Journal d'activité : connexions, changements de statut, dépôts de photo — consultable par l'admin (qui fait quoi, quand).</w:t>
+              <w:t xml:space="preserve">Copie figée des items du modèle au moment de la création de la tâche (trigger seed_task_items) — modifier le modèle après coup ne change pas les tâches déjà assignées. État coché (done_at/done_by) par item.</w:t>
+            </w:r>
+          </w:p>
+        </w:tc>
+      </w:tr>
+      <w:tr>
+        <w:tc>
+          <w:tcPr>
+            <w:tcW w:type="dxa" w:w="2400"/>
+            <w:tcMar>
+              <w:top w:type="dxa" w:w="100"/>
+              <w:left w:type="dxa" w:w="120"/>
+              <w:bottom w:type="dxa" w:w="100"/>
+              <w:right w:type="dxa" w:w="120"/>
+            </w:tcMar>
+          </w:tcPr>
+          <w:p>
+            <w:pPr>
+              <w:jc w:val="left"/>
+            </w:pPr>
+            <w:r>
+              <w:rPr>
+                <w:b/>
+                <w:bCs/>
+                <w:color w:val="1a1a1a"/>
+                <w:sz w:val="20"/>
+                <w:szCs w:val="20"/>
+              </w:rPr>
+              <w:t xml:space="preserve">task_photos</w:t>
+            </w:r>
+          </w:p>
+        </w:tc>
+        <w:tc>
+          <w:tcPr>
+            <w:tcW w:type="dxa" w:w="7200"/>
+            <w:tcMar>
+              <w:top w:type="dxa" w:w="100"/>
+              <w:left w:type="dxa" w:w="120"/>
+              <w:bottom w:type="dxa" w:w="100"/>
+              <w:right w:type="dxa" w:w="120"/>
+            </w:tcMar>
+          </w:tcPr>
+          <w:p>
+            <w:pPr>
+              <w:jc w:val="left"/>
+            </w:pPr>
+            <w:r>
+              <w:rPr>
+                <w:b w:val="false"/>
+                <w:bCs w:val="false"/>
+                <w:color w:val="1a1a1a"/>
+                <w:sz w:val="20"/>
+                <w:szCs w:val="20"/>
+              </w:rPr>
+              <w:t xml:space="preserve">Photos déposées par les employés, rattachées à un item et typées avant/après (kind), stockées dans Supabase Storage.</w:t>
+            </w:r>
+          </w:p>
+        </w:tc>
+      </w:tr>
+      <w:tr>
+        <w:tc>
+          <w:tcPr>
+            <w:tcW w:type="dxa" w:w="2400"/>
+            <w:shd w:fill="F3F4F6" w:val="clear"/>
+            <w:tcMar>
+              <w:top w:type="dxa" w:w="100"/>
+              <w:left w:type="dxa" w:w="120"/>
+              <w:bottom w:type="dxa" w:w="100"/>
+              <w:right w:type="dxa" w:w="120"/>
+            </w:tcMar>
+          </w:tcPr>
+          <w:p>
+            <w:pPr>
+              <w:jc w:val="left"/>
+            </w:pPr>
+            <w:r>
+              <w:rPr>
+                <w:b/>
+                <w:bCs/>
+                <w:color w:val="1a1a1a"/>
+                <w:sz w:val="20"/>
+                <w:szCs w:val="20"/>
+              </w:rPr>
+              <w:t xml:space="preserve">notifications</w:t>
+            </w:r>
+          </w:p>
+        </w:tc>
+        <w:tc>
+          <w:tcPr>
+            <w:tcW w:type="dxa" w:w="7200"/>
+            <w:shd w:fill="F3F4F6" w:val="clear"/>
+            <w:tcMar>
+              <w:top w:type="dxa" w:w="100"/>
+              <w:left w:type="dxa" w:w="120"/>
+              <w:bottom w:type="dxa" w:w="100"/>
+              <w:right w:type="dxa" w:w="120"/>
+            </w:tcMar>
+          </w:tcPr>
+          <w:p>
+            <w:pPr>
+              <w:jc w:val="left"/>
+            </w:pPr>
+            <w:r>
+              <w:rPr>
+                <w:b w:val="false"/>
+                <w:bCs w:val="false"/>
+                <w:color w:val="1a1a1a"/>
+                <w:sz w:val="20"/>
+                <w:szCs w:val="20"/>
+              </w:rPr>
+              <w:t xml:space="preserve">Notifications envoyées par l'admin (ciblées ou en broadcast) : info, rappel, urgent.</w:t>
+            </w:r>
+          </w:p>
+        </w:tc>
+      </w:tr>
+      <w:tr>
+        <w:tc>
+          <w:tcPr>
+            <w:tcW w:type="dxa" w:w="2400"/>
+            <w:tcMar>
+              <w:top w:type="dxa" w:w="100"/>
+              <w:left w:type="dxa" w:w="120"/>
+              <w:bottom w:type="dxa" w:w="100"/>
+              <w:right w:type="dxa" w:w="120"/>
+            </w:tcMar>
+          </w:tcPr>
+          <w:p>
+            <w:pPr>
+              <w:jc w:val="left"/>
+            </w:pPr>
+            <w:r>
+              <w:rPr>
+                <w:b/>
+                <w:bCs/>
+                <w:color w:val="1a1a1a"/>
+                <w:sz w:val="20"/>
+                <w:szCs w:val="20"/>
+              </w:rPr>
+              <w:t xml:space="preserve">activity_log</w:t>
+            </w:r>
+          </w:p>
+        </w:tc>
+        <w:tc>
+          <w:tcPr>
+            <w:tcW w:type="dxa" w:w="7200"/>
+            <w:tcMar>
+              <w:top w:type="dxa" w:w="100"/>
+              <w:left w:type="dxa" w:w="120"/>
+              <w:bottom w:type="dxa" w:w="100"/>
+              <w:right w:type="dxa" w:w="120"/>
+            </w:tcMar>
+          </w:tcPr>
+          <w:p>
+            <w:pPr>
+              <w:jc w:val="left"/>
+            </w:pPr>
+            <w:r>
+              <w:rPr>
+                <w:b w:val="false"/>
+                <w:bCs w:val="false"/>
+                <w:color w:val="1a1a1a"/>
+                <w:sz w:val="20"/>
+                <w:szCs w:val="20"/>
+              </w:rPr>
+              <w:t xml:space="preserve">Journal d'activité : connexions, changements de statut, dépôts/coches d'item, actions super-admin — consultable par l'admin (qui fait quoi, quand).</w:t>
             </w:r>
           </w:p>
         </w:tc>
@@ -1819,43 +1983,79 @@
           <w:sz w:val="21"/>
           <w:szCs w:val="21"/>
         </w:rPr>
-        <w:t xml:space="preserve">Détail d'une tâche : appartement, adresse, consignes</w:t>
-      </w:r>
-    </w:p>
-    <w:p>
-      <w:pPr>
-        <w:pStyle w:val="ListParagraph"/>
-        <w:numPr>
-          <w:ilvl w:val="0"/>
-          <w:numId w:val="1"/>
-        </w:numPr>
-        <w:spacing w:after="60"/>
-      </w:pPr>
-      <w:r>
-        <w:rPr>
-          <w:color w:val="1a1a1a"/>
-          <w:sz w:val="21"/>
-          <w:szCs w:val="21"/>
-        </w:rPr>
-        <w:t xml:space="preserve">Changement de statut d'une tâche (à faire → en cours → terminé / reporté)</w:t>
-      </w:r>
-    </w:p>
-    <w:p>
-      <w:pPr>
-        <w:pStyle w:val="ListParagraph"/>
-        <w:numPr>
-          <w:ilvl w:val="0"/>
-          <w:numId w:val="1"/>
-        </w:numPr>
-        <w:spacing w:after="60"/>
-      </w:pPr>
-      <w:r>
-        <w:rPr>
-          <w:color w:val="1a1a1a"/>
-          <w:sz w:val="21"/>
-          <w:szCs w:val="21"/>
-        </w:rPr>
-        <w:t xml:space="preserve">Dépôt de photos directement depuis le mobile (appareil photo ou galerie)</w:t>
+        <w:t xml:space="preserve">Détail d'une tâche piloté par checklist, regroupée par pièce (Cuisine, Salle de bain...)</w:t>
+      </w:r>
+    </w:p>
+    <w:p>
+      <w:pPr>
+        <w:pStyle w:val="ListParagraph"/>
+        <w:numPr>
+          <w:ilvl w:val="0"/>
+          <w:numId w:val="1"/>
+        </w:numPr>
+        <w:spacing w:after="60"/>
+      </w:pPr>
+      <w:r>
+        <w:rPr>
+          <w:color w:val="1a1a1a"/>
+          <w:sz w:val="21"/>
+          <w:szCs w:val="21"/>
+        </w:rPr>
+        <w:t xml:space="preserve">Coche un item terminé ; passage automatique de la tâche en "en cours" dès le premier item coché</w:t>
+      </w:r>
+    </w:p>
+    <w:p>
+      <w:pPr>
+        <w:pStyle w:val="ListParagraph"/>
+        <w:numPr>
+          <w:ilvl w:val="0"/>
+          <w:numId w:val="1"/>
+        </w:numPr>
+        <w:spacing w:after="60"/>
+      </w:pPr>
+      <w:r>
+        <w:rPr>
+          <w:color w:val="1a1a1a"/>
+          <w:sz w:val="21"/>
+          <w:szCs w:val="21"/>
+        </w:rPr>
+        <w:t xml:space="preserve">Capture photo avant/après par item quand la checklist l'exige, directement depuis l'appareil photo</w:t>
+      </w:r>
+    </w:p>
+    <w:p>
+      <w:pPr>
+        <w:pStyle w:val="ListParagraph"/>
+        <w:numPr>
+          <w:ilvl w:val="0"/>
+          <w:numId w:val="1"/>
+        </w:numPr>
+        <w:spacing w:after="60"/>
+      </w:pPr>
+      <w:r>
+        <w:rPr>
+          <w:color w:val="1a1a1a"/>
+          <w:sz w:val="21"/>
+          <w:szCs w:val="21"/>
+        </w:rPr>
+        <w:t xml:space="preserve">Impossible de terminer le ménage tant que tous les items ne sont pas cochés</w:t>
+      </w:r>
+    </w:p>
+    <w:p>
+      <w:pPr>
+        <w:pStyle w:val="ListParagraph"/>
+        <w:numPr>
+          <w:ilvl w:val="0"/>
+          <w:numId w:val="1"/>
+        </w:numPr>
+        <w:spacing w:after="60"/>
+      </w:pPr>
+      <w:r>
+        <w:rPr>
+          <w:color w:val="1a1a1a"/>
+          <w:sz w:val="21"/>
+          <w:szCs w:val="21"/>
+        </w:rPr>
+        <w:t xml:space="preserve">Écran Profil : statistiques du mois (ménages, photos envoyées), historique des ménages avec statut de validation, déconnexion</w:t>
       </w:r>
     </w:p>
     <w:p>
@@ -1943,7 +2143,43 @@
           <w:sz w:val="21"/>
           <w:szCs w:val="21"/>
         </w:rPr>
-        <w:t xml:space="preserve">Gestion des appartements (création, consultation)</w:t>
+        <w:t xml:space="preserve">Gestion des appartements (création, consultation, assignation d'une checklist par appartement)</w:t>
+      </w:r>
+    </w:p>
+    <w:p>
+      <w:pPr>
+        <w:pStyle w:val="ListParagraph"/>
+        <w:numPr>
+          <w:ilvl w:val="0"/>
+          <w:numId w:val="1"/>
+        </w:numPr>
+        <w:spacing w:after="60"/>
+      </w:pPr>
+      <w:r>
+        <w:rPr>
+          <w:color w:val="1a1a1a"/>
+          <w:sz w:val="21"/>
+          <w:szCs w:val="21"/>
+        </w:rPr>
+        <w:t xml:space="preserve">Checklists : consultation des modèles réutilisables par pièce (édition en base pour l'instant, UI en lecture seule)</w:t>
+      </w:r>
+    </w:p>
+    <w:p>
+      <w:pPr>
+        <w:pStyle w:val="ListParagraph"/>
+        <w:numPr>
+          <w:ilvl w:val="0"/>
+          <w:numId w:val="1"/>
+        </w:numPr>
+        <w:spacing w:after="60"/>
+      </w:pPr>
+      <w:r>
+        <w:rPr>
+          <w:color w:val="1a1a1a"/>
+          <w:sz w:val="21"/>
+          <w:szCs w:val="21"/>
+        </w:rPr>
+        <w:t xml:space="preserve">Preuves : file de ménages terminés à valider, comparaison photos avant/après par item, validation ou demande de reprise (renvoie la tâche en "à faire" et notifie l'employé·e en urgent)</w:t>
       </w:r>
     </w:p>
     <w:p>
@@ -2695,6 +2931,24 @@
     </w:p>
     <w:p>
       <w:pPr>
+        <w:pStyle w:val="ListParagraph"/>
+        <w:numPr>
+          <w:ilvl w:val="0"/>
+          <w:numId w:val="1"/>
+        </w:numPr>
+        <w:spacing w:after="60"/>
+      </w:pPr>
+      <w:r>
+        <w:rPr>
+          <w:color w:val="1a1a1a"/>
+          <w:sz w:val="21"/>
+          <w:szCs w:val="21"/>
+        </w:rPr>
+        <w:t xml:space="preserve">Design system intégré : checklists par pièce, photos avant/après par item, file de validation admin avec demande de reprise, écrans employé/admin restylés. Déclencheur de copie des items (seed_task_items) testé en conditions réelles.</w:t>
+      </w:r>
+    </w:p>
+    <w:p>
+      <w:pPr>
         <w:pStyle w:val="Heading2"/>
         <w:spacing w:after="100" w:before="220"/>
       </w:pPr>
@@ -2778,7 +3032,25 @@
           <w:sz w:val="21"/>
           <w:szCs w:val="21"/>
         </w:rPr>
-        <w:t xml:space="preserve">Peupler des données réelles (appartements, employés, planning) — le dashboard est fonctionnel mais vide.</w:t>
+        <w:t xml:space="preserve">Peupler des données réelles (appartements avec checklist assignée, employés, planning) — le dashboard est fonctionnel mais vide.</w:t>
+      </w:r>
+    </w:p>
+    <w:p>
+      <w:pPr>
+        <w:pStyle w:val="ListParagraph"/>
+        <w:numPr>
+          <w:ilvl w:val="0"/>
+          <w:numId w:val="1"/>
+        </w:numPr>
+        <w:spacing w:after="60"/>
+      </w:pPr>
+      <w:r>
+        <w:rPr>
+          <w:color w:val="1a1a1a"/>
+          <w:sz w:val="21"/>
+          <w:szCs w:val="21"/>
+        </w:rPr>
+        <w:t xml:space="preserve">Édition des modèles de checklist depuis l'admin (actuellement lecture seule dans l'UI ; modifiable en base via la table checklist_items).</w:t>
       </w:r>
     </w:p>
     <w:p>

</xml_diff>